<commit_message>
add the results from the printline to the report
</commit_message>
<xml_diff>
--- a/Assignment1/Assignment1_report_Ilia_Todorov_Georgi_Karamishev.docx
+++ b/Assignment1/Assignment1_report_Ilia_Todorov_Georgi_Karamishev.docx
@@ -193,7 +193,7 @@
             </w:rPr>
             <w:fldChar w:fldCharType="separate"/>
           </w:r>
-          <w:hyperlink w:anchor="_Toc244220264" w:history="1">
+          <w:hyperlink w:anchor="_Toc244220626" w:history="1">
             <w:r>
               <w:rPr>
                 <w:rStyle w:val="Hyperlink"/>
@@ -221,7 +221,7 @@
                 <w:noProof/>
                 <w:webHidden/>
               </w:rPr>
-              <w:instrText xml:space="preserve"> PAGEREF _Toc244220264 \h </w:instrText>
+              <w:instrText xml:space="preserve"> PAGEREF _Toc244220626 \h </w:instrText>
             </w:r>
             <w:r>
               <w:rPr>
@@ -266,7 +266,7 @@
               <w:lang w:eastAsia="en-GB"/>
             </w:rPr>
           </w:pPr>
-          <w:hyperlink w:anchor="_Toc244220265" w:history="1">
+          <w:hyperlink w:anchor="_Toc244220627" w:history="1">
             <w:r>
               <w:rPr>
                 <w:rStyle w:val="Hyperlink"/>
@@ -294,7 +294,7 @@
                 <w:noProof/>
                 <w:webHidden/>
               </w:rPr>
-              <w:instrText xml:space="preserve"> PAGEREF _Toc244220265 \h </w:instrText>
+              <w:instrText xml:space="preserve"> PAGEREF _Toc244220627 \h </w:instrText>
             </w:r>
             <w:r>
               <w:rPr>
@@ -339,7 +339,7 @@
               <w:lang w:eastAsia="en-GB"/>
             </w:rPr>
           </w:pPr>
-          <w:hyperlink w:anchor="_Toc244220266" w:history="1">
+          <w:hyperlink w:anchor="_Toc244220628" w:history="1">
             <w:r>
               <w:rPr>
                 <w:rStyle w:val="Hyperlink"/>
@@ -367,7 +367,7 @@
                 <w:noProof/>
                 <w:webHidden/>
               </w:rPr>
-              <w:instrText xml:space="preserve"> PAGEREF _Toc244220266 \h </w:instrText>
+              <w:instrText xml:space="preserve"> PAGEREF _Toc244220628 \h </w:instrText>
             </w:r>
             <w:r>
               <w:rPr>
@@ -412,7 +412,7 @@
               <w:lang w:eastAsia="en-GB"/>
             </w:rPr>
           </w:pPr>
-          <w:hyperlink w:anchor="_Toc244220267" w:history="1">
+          <w:hyperlink w:anchor="_Toc244220629" w:history="1">
             <w:r>
               <w:rPr>
                 <w:rStyle w:val="Hyperlink"/>
@@ -440,7 +440,7 @@
                 <w:noProof/>
                 <w:webHidden/>
               </w:rPr>
-              <w:instrText xml:space="preserve"> PAGEREF _Toc244220267 \h </w:instrText>
+              <w:instrText xml:space="preserve"> PAGEREF _Toc244220629 \h </w:instrText>
             </w:r>
             <w:r>
               <w:rPr>
@@ -485,7 +485,7 @@
               <w:lang w:eastAsia="en-GB"/>
             </w:rPr>
           </w:pPr>
-          <w:hyperlink w:anchor="_Toc244220268" w:history="1">
+          <w:hyperlink w:anchor="_Toc244220630" w:history="1">
             <w:r>
               <w:rPr>
                 <w:rStyle w:val="Hyperlink"/>
@@ -513,7 +513,7 @@
                 <w:noProof/>
                 <w:webHidden/>
               </w:rPr>
-              <w:instrText xml:space="preserve"> PAGEREF _Toc244220268 \h </w:instrText>
+              <w:instrText xml:space="preserve"> PAGEREF _Toc244220630 \h </w:instrText>
             </w:r>
             <w:r>
               <w:rPr>
@@ -558,7 +558,7 @@
               <w:lang w:eastAsia="en-GB"/>
             </w:rPr>
           </w:pPr>
-          <w:hyperlink w:anchor="_Toc244220269" w:history="1">
+          <w:hyperlink w:anchor="_Toc244220631" w:history="1">
             <w:r>
               <w:rPr>
                 <w:rStyle w:val="Hyperlink"/>
@@ -586,7 +586,7 @@
                 <w:noProof/>
                 <w:webHidden/>
               </w:rPr>
-              <w:instrText xml:space="preserve"> PAGEREF _Toc244220269 \h </w:instrText>
+              <w:instrText xml:space="preserve"> PAGEREF _Toc244220631 \h </w:instrText>
             </w:r>
             <w:r>
               <w:rPr>
@@ -633,7 +633,7 @@
               <w:lang w:eastAsia="en-GB"/>
             </w:rPr>
           </w:pPr>
-          <w:hyperlink w:anchor="_Toc244220270" w:history="1">
+          <w:hyperlink w:anchor="_Toc244220632" w:history="1">
             <w:r>
               <w:rPr>
                 <w:rStyle w:val="Hyperlink"/>
@@ -661,7 +661,7 @@
                 <w:noProof/>
                 <w:webHidden/>
               </w:rPr>
-              <w:instrText xml:space="preserve"> PAGEREF _Toc244220270 \h </w:instrText>
+              <w:instrText xml:space="preserve"> PAGEREF _Toc244220632 \h </w:instrText>
             </w:r>
             <w:r>
               <w:rPr>
@@ -706,7 +706,7 @@
               <w:lang w:eastAsia="en-GB"/>
             </w:rPr>
           </w:pPr>
-          <w:hyperlink w:anchor="_Toc244220271" w:history="1">
+          <w:hyperlink w:anchor="_Toc244220633" w:history="1">
             <w:r>
               <w:rPr>
                 <w:rStyle w:val="Hyperlink"/>
@@ -734,7 +734,7 @@
                 <w:noProof/>
                 <w:webHidden/>
               </w:rPr>
-              <w:instrText xml:space="preserve"> PAGEREF _Toc244220271 \h </w:instrText>
+              <w:instrText xml:space="preserve"> PAGEREF _Toc244220633 \h </w:instrText>
             </w:r>
             <w:r>
               <w:rPr>
@@ -779,7 +779,7 @@
               <w:lang w:eastAsia="en-GB"/>
             </w:rPr>
           </w:pPr>
-          <w:hyperlink w:anchor="_Toc244220272" w:history="1">
+          <w:hyperlink w:anchor="_Toc244220634" w:history="1">
             <w:r>
               <w:rPr>
                 <w:rStyle w:val="Hyperlink"/>
@@ -807,7 +807,7 @@
                 <w:noProof/>
                 <w:webHidden/>
               </w:rPr>
-              <w:instrText xml:space="preserve"> PAGEREF _Toc244220272 \h </w:instrText>
+              <w:instrText xml:space="preserve"> PAGEREF _Toc244220634 \h </w:instrText>
             </w:r>
             <w:r>
               <w:rPr>
@@ -854,7 +854,7 @@
               <w:lang w:eastAsia="en-GB"/>
             </w:rPr>
           </w:pPr>
-          <w:hyperlink w:anchor="_Toc244220273" w:history="1">
+          <w:hyperlink w:anchor="_Toc244220635" w:history="1">
             <w:r>
               <w:rPr>
                 <w:rStyle w:val="Hyperlink"/>
@@ -882,7 +882,7 @@
                 <w:noProof/>
                 <w:webHidden/>
               </w:rPr>
-              <w:instrText xml:space="preserve"> PAGEREF _Toc244220273 \h </w:instrText>
+              <w:instrText xml:space="preserve"> PAGEREF _Toc244220635 \h </w:instrText>
             </w:r>
             <w:r>
               <w:rPr>
@@ -927,7 +927,7 @@
               <w:lang w:eastAsia="en-GB"/>
             </w:rPr>
           </w:pPr>
-          <w:hyperlink w:anchor="_Toc244220274" w:history="1">
+          <w:hyperlink w:anchor="_Toc244220636" w:history="1">
             <w:r>
               <w:rPr>
                 <w:rStyle w:val="Hyperlink"/>
@@ -955,7 +955,7 @@
                 <w:noProof/>
                 <w:webHidden/>
               </w:rPr>
-              <w:instrText xml:space="preserve"> PAGEREF _Toc244220274 \h </w:instrText>
+              <w:instrText xml:space="preserve"> PAGEREF _Toc244220636 \h </w:instrText>
             </w:r>
             <w:r>
               <w:rPr>
@@ -1002,7 +1002,7 @@
               <w:lang w:eastAsia="en-GB"/>
             </w:rPr>
           </w:pPr>
-          <w:hyperlink w:anchor="_Toc244220275" w:history="1">
+          <w:hyperlink w:anchor="_Toc244220637" w:history="1">
             <w:r>
               <w:rPr>
                 <w:rStyle w:val="Hyperlink"/>
@@ -1030,7 +1030,7 @@
                 <w:noProof/>
                 <w:webHidden/>
               </w:rPr>
-              <w:instrText xml:space="preserve"> PAGEREF _Toc244220275 \h </w:instrText>
+              <w:instrText xml:space="preserve"> PAGEREF _Toc244220637 \h </w:instrText>
             </w:r>
             <w:r>
               <w:rPr>
@@ -1077,7 +1077,7 @@
               <w:lang w:eastAsia="en-GB"/>
             </w:rPr>
           </w:pPr>
-          <w:hyperlink w:anchor="_Toc244220276" w:history="1">
+          <w:hyperlink w:anchor="_Toc244220638" w:history="1">
             <w:r>
               <w:rPr>
                 <w:rStyle w:val="Hyperlink"/>
@@ -1105,7 +1105,7 @@
                 <w:noProof/>
                 <w:webHidden/>
               </w:rPr>
-              <w:instrText xml:space="preserve"> PAGEREF _Toc244220276 \h </w:instrText>
+              <w:instrText xml:space="preserve"> PAGEREF _Toc244220638 \h </w:instrText>
             </w:r>
             <w:r>
               <w:rPr>
@@ -1125,7 +1125,7 @@
                 <w:noProof/>
                 <w:webHidden/>
               </w:rPr>
-              <w:t>7</w:t>
+              <w:t>9</w:t>
             </w:r>
             <w:r>
               <w:rPr>
@@ -1213,7 +1213,7 @@
           <w:lang w:val="en-US"/>
         </w:rPr>
       </w:pPr>
-      <w:bookmarkStart w:id="0" w:name="_Toc244220264"/>
+      <w:bookmarkStart w:id="0" w:name="_Toc244220626"/>
       <w:r>
         <w:rPr>
           <w:lang w:val="en-US"/>
@@ -1345,7 +1345,7 @@
           <w:lang w:val="en-US"/>
         </w:rPr>
       </w:pPr>
-      <w:bookmarkStart w:id="1" w:name="_Toc244220265"/>
+      <w:bookmarkStart w:id="1" w:name="_Toc244220627"/>
       <w:r>
         <w:rPr>
           <w:lang w:val="en-US"/>
@@ -1412,7 +1412,7 @@
           <w:lang w:val="en-US"/>
         </w:rPr>
       </w:pPr>
-      <w:bookmarkStart w:id="2" w:name="_Toc244220266"/>
+      <w:bookmarkStart w:id="2" w:name="_Toc244220628"/>
       <w:r>
         <w:rPr>
           <w:lang w:val="en-US"/>
@@ -1496,7 +1496,7 @@
           <w:lang w:val="en-US"/>
         </w:rPr>
       </w:pPr>
-      <w:bookmarkStart w:id="3" w:name="_Toc244220267"/>
+      <w:bookmarkStart w:id="3" w:name="_Toc244220629"/>
       <w:r>
         <w:rPr>
           <w:lang w:val="en-US"/>
@@ -1911,7 +1911,7 @@
           <w:lang w:val="en-US"/>
         </w:rPr>
       </w:pPr>
-      <w:bookmarkStart w:id="4" w:name="_Toc244220268"/>
+      <w:bookmarkStart w:id="4" w:name="_Toc244220630"/>
       <w:r>
         <w:rPr>
           <w:lang w:val="en-US"/>
@@ -1995,7 +1995,7 @@
           <w:lang w:val="en-US"/>
         </w:rPr>
       </w:pPr>
-      <w:bookmarkStart w:id="5" w:name="_Toc244220269"/>
+      <w:bookmarkStart w:id="5" w:name="_Toc244220631"/>
       <w:r>
         <w:rPr>
           <w:lang w:val="en-US"/>
@@ -2037,7 +2037,7 @@
           <w:lang w:val="en-US"/>
         </w:rPr>
       </w:pPr>
-      <w:bookmarkStart w:id="6" w:name="_Toc244220270"/>
+      <w:bookmarkStart w:id="6" w:name="_Toc244220632"/>
       <w:r>
         <w:rPr>
           <w:lang w:val="en-US"/>
@@ -2072,7 +2072,7 @@
           <w:lang w:val="en-US"/>
         </w:rPr>
       </w:pPr>
-      <w:bookmarkStart w:id="7" w:name="_Toc244220271"/>
+      <w:bookmarkStart w:id="7" w:name="_Toc244220633"/>
       <w:r>
         <w:rPr>
           <w:lang w:val="en-US"/>
@@ -2135,7 +2135,7 @@
           <w:lang w:val="en-US"/>
         </w:rPr>
       </w:pPr>
-      <w:bookmarkStart w:id="8" w:name="_Toc244220272"/>
+      <w:bookmarkStart w:id="8" w:name="_Toc244220634"/>
       <w:r>
         <w:rPr>
           <w:lang w:val="en-US"/>
@@ -2273,7 +2273,7 @@
           <w:lang w:val="en-US"/>
         </w:rPr>
       </w:pPr>
-      <w:bookmarkStart w:id="9" w:name="_Toc244220273"/>
+      <w:bookmarkStart w:id="9" w:name="_Toc244220635"/>
       <w:r>
         <w:rPr>
           <w:lang w:val="en-US"/>
@@ -2334,7 +2334,7 @@
           <w:lang w:val="en-US"/>
         </w:rPr>
       </w:pPr>
-      <w:bookmarkStart w:id="10" w:name="_Toc244220274"/>
+      <w:bookmarkStart w:id="10" w:name="_Toc244220636"/>
       <w:r>
         <w:rPr>
           <w:lang w:val="en-US"/>
@@ -2443,7 +2443,7 @@
           <w:lang w:val="en-US"/>
         </w:rPr>
       </w:pPr>
-      <w:bookmarkStart w:id="11" w:name="_Toc244220275"/>
+      <w:bookmarkStart w:id="11" w:name="_Toc244220637"/>
       <w:r>
         <w:rPr>
           <w:lang w:val="en-US"/>
@@ -2476,6 +2476,878 @@
         </w:rPr>
         <w:t>ife expectancy depends on how much wealth there is per person, not on the total size of the economy. GDP per capita says much more about living standards, such as healthcare, nutrition and sanitation, so it predicts life expectancy far better.</w:t>
       </w:r>
+      <w:r>
+        <w:t xml:space="preserve"> </w:t>
+      </w:r>
+      <w:r>
+        <w:t xml:space="preserve"> </w:t>
+      </w:r>
+      <w:r>
+        <w:rPr>
+          <w:sz w:val="28"/>
+          <w:szCs w:val="28"/>
+          <w:lang w:val="en-US"/>
+        </w:rPr>
+        <w:t xml:space="preserve">The </w:t>
+      </w:r>
+      <w:proofErr w:type="gramStart"/>
+      <w:r>
+        <w:rPr>
+          <w:sz w:val="28"/>
+          <w:szCs w:val="28"/>
+          <w:lang w:val="en-US"/>
+        </w:rPr>
+        <w:t>top-15</w:t>
+      </w:r>
+      <w:proofErr w:type="gramEnd"/>
+      <w:r>
+        <w:rPr>
+          <w:sz w:val="28"/>
+          <w:szCs w:val="28"/>
+          <w:lang w:val="en-US"/>
+        </w:rPr>
+        <w:t xml:space="preserve"> list also changes almost completely: only the US is in both. It switches from large-population countries to small, rich countries like Singapore, Luxembourg and Qatar. Even so, a high GDP per capita doesn't guarantee high life expectancy. Brunei, and the US being only just above the line (79.3), suggest that inequality and how wealth is spent also matter.</w:t>
+      </w:r>
+    </w:p>
+    <w:p>
+      <w:pPr>
+        <w:rPr>
+          <w:sz w:val="28"/>
+          <w:szCs w:val="28"/>
+          <w:lang w:val="en-US"/>
+        </w:rPr>
+      </w:pPr>
+    </w:p>
+    <w:p>
+      <w:pPr>
+        <w:rPr>
+          <w:sz w:val="28"/>
+          <w:szCs w:val="28"/>
+          <w:lang w:val="en-US"/>
+        </w:rPr>
+      </w:pPr>
+    </w:p>
+    <w:p>
+      <w:pPr>
+        <w:rPr>
+          <w:sz w:val="28"/>
+          <w:szCs w:val="28"/>
+          <w:lang w:val="en-US"/>
+        </w:rPr>
+      </w:pPr>
+      <w:r>
+        <w:rPr>
+          <w:sz w:val="28"/>
+          <w:szCs w:val="28"/>
+          <w:lang w:val="en-US"/>
+        </w:rPr>
+        <w:lastRenderedPageBreak/>
+        <w:t>From the code result (print after the plots):</w:t>
+      </w:r>
+    </w:p>
+    <w:p>
+      <w:pPr>
+        <w:rPr>
+          <w:sz w:val="28"/>
+          <w:szCs w:val="28"/>
+          <w:lang w:val="en-US"/>
+        </w:rPr>
+      </w:pPr>
+      <w:r>
+        <w:rPr>
+          <w:sz w:val="28"/>
+          <w:szCs w:val="28"/>
+          <w:lang w:val="en-US"/>
+        </w:rPr>
+        <w:t>Top 15 countries by total GDP in 2023:</w:t>
+      </w:r>
+    </w:p>
+    <w:p>
+      <w:pPr>
+        <w:pStyle w:val="ListParagraph"/>
+        <w:numPr>
+          <w:ilvl w:val="0"/>
+          <w:numId w:val="5"/>
+        </w:numPr>
+        <w:jc w:val="both"/>
+        <w:rPr>
+          <w:lang w:val="en-US"/>
+        </w:rPr>
+      </w:pPr>
+      <w:r>
+        <w:rPr>
+          <w:lang w:val="en-US"/>
+        </w:rPr>
+        <w:t xml:space="preserve">Country            </w:t>
+      </w:r>
+      <w:proofErr w:type="gramStart"/>
+      <w:r>
+        <w:rPr>
+          <w:lang w:val="en-US"/>
+        </w:rPr>
+        <w:t>GDP  Life</w:t>
+      </w:r>
+      <w:proofErr w:type="gramEnd"/>
+      <w:r>
+        <w:rPr>
+          <w:lang w:val="en-US"/>
+        </w:rPr>
+        <w:t xml:space="preserve"> expectancy</w:t>
+      </w:r>
+    </w:p>
+    <w:p>
+      <w:pPr>
+        <w:pStyle w:val="ListParagraph"/>
+        <w:numPr>
+          <w:ilvl w:val="0"/>
+          <w:numId w:val="5"/>
+        </w:numPr>
+        <w:jc w:val="both"/>
+        <w:rPr>
+          <w:lang w:val="en-US"/>
+        </w:rPr>
+      </w:pPr>
+      <w:r>
+        <w:rPr>
+          <w:lang w:val="en-US"/>
+        </w:rPr>
+        <w:t>China 32005133203227          77.9529</w:t>
+      </w:r>
+    </w:p>
+    <w:p>
+      <w:pPr>
+        <w:pStyle w:val="ListParagraph"/>
+        <w:numPr>
+          <w:ilvl w:val="0"/>
+          <w:numId w:val="5"/>
+        </w:numPr>
+        <w:jc w:val="both"/>
+        <w:rPr>
+          <w:lang w:val="en-US"/>
+        </w:rPr>
+      </w:pPr>
+      <w:r>
+        <w:rPr>
+          <w:lang w:val="en-US"/>
+        </w:rPr>
+        <w:t>United States 25038301109944          79.3043</w:t>
+      </w:r>
+    </w:p>
+    <w:p>
+      <w:pPr>
+        <w:pStyle w:val="ListParagraph"/>
+        <w:numPr>
+          <w:ilvl w:val="0"/>
+          <w:numId w:val="5"/>
+        </w:numPr>
+        <w:jc w:val="both"/>
+        <w:rPr>
+          <w:lang w:val="en-US"/>
+        </w:rPr>
+      </w:pPr>
+      <w:r>
+        <w:rPr>
+          <w:lang w:val="en-US"/>
+        </w:rPr>
+        <w:t>India 12756468651839          72.0026</w:t>
+      </w:r>
+    </w:p>
+    <w:p>
+      <w:pPr>
+        <w:pStyle w:val="ListParagraph"/>
+        <w:numPr>
+          <w:ilvl w:val="0"/>
+          <w:numId w:val="5"/>
+        </w:numPr>
+        <w:jc w:val="both"/>
+        <w:rPr>
+          <w:lang w:val="en-US"/>
+        </w:rPr>
+      </w:pPr>
+      <w:proofErr w:type="gramStart"/>
+      <w:r>
+        <w:rPr>
+          <w:lang w:val="en-US"/>
+        </w:rPr>
+        <w:t>Japan  5900497545321</w:t>
+      </w:r>
+      <w:proofErr w:type="gramEnd"/>
+      <w:r>
+        <w:rPr>
+          <w:lang w:val="en-US"/>
+        </w:rPr>
+        <w:t xml:space="preserve">          84.7123</w:t>
+      </w:r>
+    </w:p>
+    <w:p>
+      <w:pPr>
+        <w:pStyle w:val="ListParagraph"/>
+        <w:numPr>
+          <w:ilvl w:val="0"/>
+          <w:numId w:val="5"/>
+        </w:numPr>
+        <w:jc w:val="both"/>
+        <w:rPr>
+          <w:lang w:val="en-US"/>
+        </w:rPr>
+      </w:pPr>
+      <w:proofErr w:type="gramStart"/>
+      <w:r>
+        <w:rPr>
+          <w:lang w:val="en-US"/>
+        </w:rPr>
+        <w:t>Russia  5834620196473</w:t>
+      </w:r>
+      <w:proofErr w:type="gramEnd"/>
+      <w:r>
+        <w:rPr>
+          <w:lang w:val="en-US"/>
+        </w:rPr>
+        <w:t xml:space="preserve">          73.1541</w:t>
+      </w:r>
+    </w:p>
+    <w:p>
+      <w:pPr>
+        <w:pStyle w:val="ListParagraph"/>
+        <w:numPr>
+          <w:ilvl w:val="0"/>
+          <w:numId w:val="5"/>
+        </w:numPr>
+        <w:jc w:val="both"/>
+        <w:rPr>
+          <w:lang w:val="en-US"/>
+        </w:rPr>
+      </w:pPr>
+      <w:proofErr w:type="gramStart"/>
+      <w:r>
+        <w:rPr>
+          <w:lang w:val="en-US"/>
+        </w:rPr>
+        <w:t>Germany  5258774650739</w:t>
+      </w:r>
+      <w:proofErr w:type="gramEnd"/>
+      <w:r>
+        <w:rPr>
+          <w:lang w:val="en-US"/>
+        </w:rPr>
+        <w:t xml:space="preserve">          81.3777</w:t>
+      </w:r>
+    </w:p>
+    <w:p>
+      <w:pPr>
+        <w:pStyle w:val="ListParagraph"/>
+        <w:numPr>
+          <w:ilvl w:val="0"/>
+          <w:numId w:val="5"/>
+        </w:numPr>
+        <w:jc w:val="both"/>
+        <w:rPr>
+          <w:lang w:val="en-US"/>
+        </w:rPr>
+      </w:pPr>
+      <w:proofErr w:type="gramStart"/>
+      <w:r>
+        <w:rPr>
+          <w:lang w:val="en-US"/>
+        </w:rPr>
+        <w:t>Brazil  4028525459920</w:t>
+      </w:r>
+      <w:proofErr w:type="gramEnd"/>
+      <w:r>
+        <w:rPr>
+          <w:lang w:val="en-US"/>
+        </w:rPr>
+        <w:t xml:space="preserve">          75.8482</w:t>
+      </w:r>
+    </w:p>
+    <w:p>
+      <w:pPr>
+        <w:pStyle w:val="ListParagraph"/>
+        <w:numPr>
+          <w:ilvl w:val="0"/>
+          <w:numId w:val="5"/>
+        </w:numPr>
+        <w:jc w:val="both"/>
+        <w:rPr>
+          <w:lang w:val="en-US"/>
+        </w:rPr>
+      </w:pPr>
+      <w:proofErr w:type="gramStart"/>
+      <w:r>
+        <w:rPr>
+          <w:lang w:val="en-US"/>
+        </w:rPr>
+        <w:t>Indonesia  3905715830893</w:t>
+      </w:r>
+      <w:proofErr w:type="gramEnd"/>
+      <w:r>
+        <w:rPr>
+          <w:lang w:val="en-US"/>
+        </w:rPr>
+        <w:t xml:space="preserve">          71.1457</w:t>
+      </w:r>
+    </w:p>
+    <w:p>
+      <w:pPr>
+        <w:pStyle w:val="ListParagraph"/>
+        <w:numPr>
+          <w:ilvl w:val="0"/>
+          <w:numId w:val="5"/>
+        </w:numPr>
+        <w:jc w:val="both"/>
+        <w:rPr>
+          <w:lang w:val="en-US"/>
+        </w:rPr>
+      </w:pPr>
+      <w:proofErr w:type="gramStart"/>
+      <w:r>
+        <w:rPr>
+          <w:lang w:val="en-US"/>
+        </w:rPr>
+        <w:t>France  3712391079956</w:t>
+      </w:r>
+      <w:proofErr w:type="gramEnd"/>
+      <w:r>
+        <w:rPr>
+          <w:lang w:val="en-US"/>
+        </w:rPr>
+        <w:t xml:space="preserve">          83.3253</w:t>
+      </w:r>
+    </w:p>
+    <w:p>
+      <w:pPr>
+        <w:pStyle w:val="ListParagraph"/>
+        <w:numPr>
+          <w:ilvl w:val="0"/>
+          <w:numId w:val="5"/>
+        </w:numPr>
+        <w:jc w:val="both"/>
+        <w:rPr>
+          <w:lang w:val="en-US"/>
+        </w:rPr>
+      </w:pPr>
+      <w:r>
+        <w:rPr>
+          <w:lang w:val="en-US"/>
+        </w:rPr>
+        <w:t xml:space="preserve">United </w:t>
+      </w:r>
+      <w:proofErr w:type="gramStart"/>
+      <w:r>
+        <w:rPr>
+          <w:lang w:val="en-US"/>
+        </w:rPr>
+        <w:t>Kingdom  3660893459405</w:t>
+      </w:r>
+      <w:proofErr w:type="gramEnd"/>
+      <w:r>
+        <w:rPr>
+          <w:lang w:val="en-US"/>
+        </w:rPr>
+        <w:t xml:space="preserve">          81.3015</w:t>
+      </w:r>
+    </w:p>
+    <w:p>
+      <w:pPr>
+        <w:pStyle w:val="ListParagraph"/>
+        <w:numPr>
+          <w:ilvl w:val="0"/>
+          <w:numId w:val="5"/>
+        </w:numPr>
+        <w:jc w:val="both"/>
+        <w:rPr>
+          <w:lang w:val="en-US"/>
+        </w:rPr>
+      </w:pPr>
+      <w:proofErr w:type="gramStart"/>
+      <w:r>
+        <w:rPr>
+          <w:lang w:val="en-US"/>
+        </w:rPr>
+        <w:t>Italy  3116881036053</w:t>
+      </w:r>
+      <w:proofErr w:type="gramEnd"/>
+      <w:r>
+        <w:rPr>
+          <w:lang w:val="en-US"/>
+        </w:rPr>
+        <w:t xml:space="preserve">          83.7157</w:t>
+      </w:r>
+    </w:p>
+    <w:p>
+      <w:pPr>
+        <w:pStyle w:val="ListParagraph"/>
+        <w:numPr>
+          <w:ilvl w:val="0"/>
+          <w:numId w:val="5"/>
+        </w:numPr>
+        <w:jc w:val="both"/>
+        <w:rPr>
+          <w:lang w:val="en-US"/>
+        </w:rPr>
+      </w:pPr>
+      <w:proofErr w:type="gramStart"/>
+      <w:r>
+        <w:rPr>
+          <w:lang w:val="en-US"/>
+        </w:rPr>
+        <w:t>Turkey  2992310786629</w:t>
+      </w:r>
+      <w:proofErr w:type="gramEnd"/>
+      <w:r>
+        <w:rPr>
+          <w:lang w:val="en-US"/>
+        </w:rPr>
+        <w:t xml:space="preserve">          77.1557</w:t>
+      </w:r>
+    </w:p>
+    <w:p>
+      <w:pPr>
+        <w:pStyle w:val="ListParagraph"/>
+        <w:numPr>
+          <w:ilvl w:val="0"/>
+          <w:numId w:val="5"/>
+        </w:numPr>
+        <w:jc w:val="both"/>
+        <w:rPr>
+          <w:lang w:val="en-US"/>
+        </w:rPr>
+      </w:pPr>
+      <w:proofErr w:type="gramStart"/>
+      <w:r>
+        <w:rPr>
+          <w:lang w:val="en-US"/>
+        </w:rPr>
+        <w:t>Mexico  2836749919768</w:t>
+      </w:r>
+      <w:proofErr w:type="gramEnd"/>
+      <w:r>
+        <w:rPr>
+          <w:lang w:val="en-US"/>
+        </w:rPr>
+        <w:t xml:space="preserve">          75.0690</w:t>
+      </w:r>
+    </w:p>
+    <w:p>
+      <w:pPr>
+        <w:pStyle w:val="ListParagraph"/>
+        <w:numPr>
+          <w:ilvl w:val="0"/>
+          <w:numId w:val="5"/>
+        </w:numPr>
+        <w:jc w:val="both"/>
+        <w:rPr>
+          <w:lang w:val="en-US"/>
+        </w:rPr>
+      </w:pPr>
+      <w:r>
+        <w:rPr>
+          <w:lang w:val="en-US"/>
+        </w:rPr>
+        <w:t xml:space="preserve">South </w:t>
+      </w:r>
+      <w:proofErr w:type="gramStart"/>
+      <w:r>
+        <w:rPr>
+          <w:lang w:val="en-US"/>
+        </w:rPr>
+        <w:t>Korea  2793998855187</w:t>
+      </w:r>
+      <w:proofErr w:type="gramEnd"/>
+      <w:r>
+        <w:rPr>
+          <w:lang w:val="en-US"/>
+        </w:rPr>
+        <w:t xml:space="preserve">          84.3288</w:t>
+      </w:r>
+    </w:p>
+    <w:p>
+      <w:pPr>
+        <w:pStyle w:val="ListParagraph"/>
+        <w:numPr>
+          <w:ilvl w:val="0"/>
+          <w:numId w:val="5"/>
+        </w:numPr>
+        <w:jc w:val="both"/>
+        <w:rPr>
+          <w:lang w:val="en-US"/>
+        </w:rPr>
+      </w:pPr>
+      <w:proofErr w:type="gramStart"/>
+      <w:r>
+        <w:rPr>
+          <w:lang w:val="en-US"/>
+        </w:rPr>
+        <w:t>Canada  2326386554601</w:t>
+      </w:r>
+      <w:proofErr w:type="gramEnd"/>
+      <w:r>
+        <w:rPr>
+          <w:lang w:val="en-US"/>
+        </w:rPr>
+        <w:t xml:space="preserve">          82.6302</w:t>
+      </w:r>
+    </w:p>
+    <w:p>
+      <w:pPr>
+        <w:rPr>
+          <w:sz w:val="28"/>
+          <w:szCs w:val="28"/>
+          <w:lang w:val="en-US"/>
+        </w:rPr>
+      </w:pPr>
+    </w:p>
+    <w:p>
+      <w:pPr>
+        <w:rPr>
+          <w:sz w:val="28"/>
+          <w:szCs w:val="28"/>
+          <w:lang w:val="en-US"/>
+        </w:rPr>
+      </w:pPr>
+      <w:r>
+        <w:rPr>
+          <w:sz w:val="28"/>
+          <w:szCs w:val="28"/>
+          <w:lang w:val="en-US"/>
+        </w:rPr>
+        <w:t>Top 15 countries by GDP per capita in 2023:</w:t>
+      </w:r>
+    </w:p>
+    <w:p>
+      <w:pPr>
+        <w:pStyle w:val="ListParagraph"/>
+        <w:numPr>
+          <w:ilvl w:val="0"/>
+          <w:numId w:val="6"/>
+        </w:numPr>
+        <w:jc w:val="both"/>
+        <w:rPr>
+          <w:lang w:val="en-US"/>
+        </w:rPr>
+      </w:pPr>
+      <w:proofErr w:type="gramStart"/>
+      <w:r>
+        <w:rPr>
+          <w:lang w:val="en-US"/>
+        </w:rPr>
+        <w:t>Country  GDP</w:t>
+      </w:r>
+      <w:proofErr w:type="gramEnd"/>
+      <w:r>
+        <w:rPr>
+          <w:lang w:val="en-US"/>
+        </w:rPr>
+        <w:t xml:space="preserve"> per </w:t>
+      </w:r>
+      <w:proofErr w:type="gramStart"/>
+      <w:r>
+        <w:rPr>
+          <w:lang w:val="en-US"/>
+        </w:rPr>
+        <w:t>capita  Life</w:t>
+      </w:r>
+      <w:proofErr w:type="gramEnd"/>
+      <w:r>
+        <w:rPr>
+          <w:lang w:val="en-US"/>
+        </w:rPr>
+        <w:t xml:space="preserve"> expectancy</w:t>
+      </w:r>
+    </w:p>
+    <w:p>
+      <w:pPr>
+        <w:pStyle w:val="ListParagraph"/>
+        <w:numPr>
+          <w:ilvl w:val="0"/>
+          <w:numId w:val="6"/>
+        </w:numPr>
+        <w:jc w:val="both"/>
+        <w:rPr>
+          <w:lang w:val="en-US"/>
+        </w:rPr>
+      </w:pPr>
+      <w:r>
+        <w:rPr>
+          <w:lang w:val="en-US"/>
+        </w:rPr>
+        <w:t>Singapore      130296.840          83.7362</w:t>
+      </w:r>
+    </w:p>
+    <w:p>
+      <w:pPr>
+        <w:pStyle w:val="ListParagraph"/>
+        <w:numPr>
+          <w:ilvl w:val="0"/>
+          <w:numId w:val="6"/>
+        </w:numPr>
+        <w:jc w:val="both"/>
+        <w:rPr>
+          <w:lang w:val="en-US"/>
+        </w:rPr>
+      </w:pPr>
+      <w:r>
+        <w:rPr>
+          <w:lang w:val="en-US"/>
+        </w:rPr>
+        <w:t>Luxembourg      130048.920          82.2294</w:t>
+      </w:r>
+    </w:p>
+    <w:p>
+      <w:pPr>
+        <w:pStyle w:val="ListParagraph"/>
+        <w:numPr>
+          <w:ilvl w:val="0"/>
+          <w:numId w:val="6"/>
+        </w:numPr>
+        <w:jc w:val="both"/>
+        <w:rPr>
+          <w:lang w:val="en-US"/>
+        </w:rPr>
+      </w:pPr>
+      <w:r>
+        <w:rPr>
+          <w:lang w:val="en-US"/>
+        </w:rPr>
+        <w:t>Ireland      117659.730          82.4118</w:t>
+      </w:r>
+    </w:p>
+    <w:p>
+      <w:pPr>
+        <w:pStyle w:val="ListParagraph"/>
+        <w:numPr>
+          <w:ilvl w:val="0"/>
+          <w:numId w:val="6"/>
+        </w:numPr>
+        <w:jc w:val="both"/>
+        <w:rPr>
+          <w:lang w:val="en-US"/>
+        </w:rPr>
+      </w:pPr>
+      <w:r>
+        <w:rPr>
+          <w:lang w:val="en-US"/>
+        </w:rPr>
+        <w:t>Qatar      116159.140          82.3680</w:t>
+      </w:r>
+    </w:p>
+    <w:p>
+      <w:pPr>
+        <w:pStyle w:val="ListParagraph"/>
+        <w:numPr>
+          <w:ilvl w:val="0"/>
+          <w:numId w:val="6"/>
+        </w:numPr>
+        <w:jc w:val="both"/>
+        <w:rPr>
+          <w:lang w:val="en-US"/>
+        </w:rPr>
+      </w:pPr>
+      <w:r>
+        <w:rPr>
+          <w:lang w:val="en-US"/>
+        </w:rPr>
+        <w:t>Norway       94364.960          83.3078</w:t>
+      </w:r>
+    </w:p>
+    <w:p>
+      <w:pPr>
+        <w:pStyle w:val="ListParagraph"/>
+        <w:numPr>
+          <w:ilvl w:val="0"/>
+          <w:numId w:val="6"/>
+        </w:numPr>
+        <w:jc w:val="both"/>
+        <w:rPr>
+          <w:lang w:val="en-US"/>
+        </w:rPr>
+      </w:pPr>
+      <w:r>
+        <w:rPr>
+          <w:lang w:val="en-US"/>
+        </w:rPr>
+        <w:t>Switzerland       85383.360          83.9536</w:t>
+      </w:r>
+    </w:p>
+    <w:p>
+      <w:pPr>
+        <w:pStyle w:val="ListParagraph"/>
+        <w:numPr>
+          <w:ilvl w:val="0"/>
+          <w:numId w:val="6"/>
+        </w:numPr>
+        <w:jc w:val="both"/>
+        <w:rPr>
+          <w:lang w:val="en-US"/>
+        </w:rPr>
+      </w:pPr>
+      <w:r>
+        <w:rPr>
+          <w:lang w:val="en-US"/>
+        </w:rPr>
+        <w:t>Brunei       76616.700          75.3266</w:t>
+      </w:r>
+    </w:p>
+    <w:p>
+      <w:pPr>
+        <w:pStyle w:val="ListParagraph"/>
+        <w:numPr>
+          <w:ilvl w:val="0"/>
+          <w:numId w:val="6"/>
+        </w:numPr>
+        <w:jc w:val="both"/>
+        <w:rPr>
+          <w:lang w:val="en-US"/>
+        </w:rPr>
+      </w:pPr>
+      <w:r>
+        <w:rPr>
+          <w:lang w:val="en-US"/>
+        </w:rPr>
+        <w:t>United States       74351.670          79.3043</w:t>
+      </w:r>
+    </w:p>
+    <w:p>
+      <w:pPr>
+        <w:pStyle w:val="ListParagraph"/>
+        <w:numPr>
+          <w:ilvl w:val="0"/>
+          <w:numId w:val="6"/>
+        </w:numPr>
+        <w:jc w:val="both"/>
+        <w:rPr>
+          <w:lang w:val="en-US"/>
+        </w:rPr>
+      </w:pPr>
+      <w:r>
+        <w:rPr>
+          <w:lang w:val="en-US"/>
+        </w:rPr>
+        <w:t>San Marino       70951.790          85.7062</w:t>
+      </w:r>
+    </w:p>
+    <w:p>
+      <w:pPr>
+        <w:pStyle w:val="ListParagraph"/>
+        <w:numPr>
+          <w:ilvl w:val="0"/>
+          <w:numId w:val="6"/>
+        </w:numPr>
+        <w:jc w:val="both"/>
+        <w:rPr>
+          <w:lang w:val="en-US"/>
+        </w:rPr>
+      </w:pPr>
+      <w:r>
+        <w:rPr>
+          <w:lang w:val="en-US"/>
+        </w:rPr>
+        <w:t>United Arab Emirates       70239.836          82.9091</w:t>
+      </w:r>
+    </w:p>
+    <w:p>
+      <w:pPr>
+        <w:pStyle w:val="ListParagraph"/>
+        <w:numPr>
+          <w:ilvl w:val="0"/>
+          <w:numId w:val="6"/>
+        </w:numPr>
+        <w:jc w:val="both"/>
+        <w:rPr>
+          <w:lang w:val="en-US"/>
+        </w:rPr>
+      </w:pPr>
+      <w:r>
+        <w:rPr>
+          <w:lang w:val="en-US"/>
+        </w:rPr>
+        <w:t>Netherlands       70198.950          82.1576</w:t>
+      </w:r>
+    </w:p>
+    <w:p>
+      <w:pPr>
+        <w:pStyle w:val="ListParagraph"/>
+        <w:numPr>
+          <w:ilvl w:val="0"/>
+          <w:numId w:val="6"/>
+        </w:numPr>
+        <w:jc w:val="both"/>
+        <w:rPr>
+          <w:lang w:val="en-US"/>
+        </w:rPr>
+      </w:pPr>
+      <w:r>
+        <w:rPr>
+          <w:lang w:val="en-US"/>
+        </w:rPr>
+        <w:t>Iceland       69268.125          82.6911</w:t>
+      </w:r>
+    </w:p>
+    <w:p>
+      <w:pPr>
+        <w:pStyle w:val="ListParagraph"/>
+        <w:numPr>
+          <w:ilvl w:val="0"/>
+          <w:numId w:val="6"/>
+        </w:numPr>
+        <w:jc w:val="both"/>
+        <w:rPr>
+          <w:lang w:val="en-US"/>
+        </w:rPr>
+      </w:pPr>
+      <w:r>
+        <w:rPr>
+          <w:lang w:val="en-US"/>
+        </w:rPr>
+        <w:t>Denmark       68993.910          81.9328</w:t>
+      </w:r>
+    </w:p>
+    <w:p>
+      <w:pPr>
+        <w:pStyle w:val="ListParagraph"/>
+        <w:numPr>
+          <w:ilvl w:val="0"/>
+          <w:numId w:val="6"/>
+        </w:numPr>
+        <w:jc w:val="both"/>
+        <w:rPr>
+          <w:lang w:val="en-US"/>
+        </w:rPr>
+      </w:pPr>
+      <w:r>
+        <w:rPr>
+          <w:lang w:val="en-US"/>
+        </w:rPr>
+        <w:t>Andorra       64631.297          84.0406</w:t>
+      </w:r>
+    </w:p>
+    <w:p>
+      <w:pPr>
+        <w:pStyle w:val="ListParagraph"/>
+        <w:numPr>
+          <w:ilvl w:val="0"/>
+          <w:numId w:val="6"/>
+        </w:numPr>
+        <w:jc w:val="both"/>
+        <w:rPr>
+          <w:lang w:val="en-US"/>
+        </w:rPr>
+      </w:pPr>
+      <w:r>
+        <w:rPr>
+          <w:lang w:val="en-US"/>
+        </w:rPr>
+        <w:t>Austria       64536.207          81.9559</w:t>
+      </w:r>
+    </w:p>
+    <w:p>
+      <w:pPr>
+        <w:rPr>
+          <w:sz w:val="28"/>
+          <w:szCs w:val="28"/>
+          <w:lang w:val="en-US"/>
+        </w:rPr>
+      </w:pPr>
     </w:p>
     <w:p>
       <w:pPr>
@@ -2484,7 +3356,7 @@
           <w:lang w:val="en-US"/>
         </w:rPr>
       </w:pPr>
-      <w:bookmarkStart w:id="12" w:name="_Toc244220276"/>
+      <w:bookmarkStart w:id="12" w:name="_Toc244220638"/>
       <w:r>
         <w:rPr>
           <w:lang w:val="en-US"/>
@@ -2678,6 +3550,119 @@
     </w:lvl>
   </w:abstractNum>
   <w:abstractNum w:abstractNumId="1" w15:restartNumberingAfterBreak="0">
+    <w:nsid w:val="11D971A8"/>
+    <w:multiLevelType w:val="hybridMultilevel"/>
+    <w:tmpl w:val="0E3457A0"/>
+    <w:lvl w:ilvl="0" w:tplc="08090001">
+      <w:start w:val="1"/>
+      <w:numFmt w:val="bullet"/>
+      <w:lvlText w:val=""/>
+      <w:lvlJc w:val="left"/>
+      <w:pPr>
+        <w:ind w:left="720" w:hanging="360"/>
+      </w:pPr>
+      <w:rPr>
+        <w:rFonts w:ascii="Symbol" w:hAnsi="Symbol" w:hint="default"/>
+      </w:rPr>
+    </w:lvl>
+    <w:lvl w:ilvl="1" w:tplc="08090003" w:tentative="1">
+      <w:start w:val="1"/>
+      <w:numFmt w:val="bullet"/>
+      <w:lvlText w:val="o"/>
+      <w:lvlJc w:val="left"/>
+      <w:pPr>
+        <w:ind w:left="1440" w:hanging="360"/>
+      </w:pPr>
+      <w:rPr>
+        <w:rFonts w:ascii="Courier New" w:hAnsi="Courier New" w:cs="Courier New" w:hint="default"/>
+      </w:rPr>
+    </w:lvl>
+    <w:lvl w:ilvl="2" w:tplc="08090005" w:tentative="1">
+      <w:start w:val="1"/>
+      <w:numFmt w:val="bullet"/>
+      <w:lvlText w:val=""/>
+      <w:lvlJc w:val="left"/>
+      <w:pPr>
+        <w:ind w:left="2160" w:hanging="360"/>
+      </w:pPr>
+      <w:rPr>
+        <w:rFonts w:ascii="Wingdings" w:hAnsi="Wingdings" w:hint="default"/>
+      </w:rPr>
+    </w:lvl>
+    <w:lvl w:ilvl="3" w:tplc="08090001" w:tentative="1">
+      <w:start w:val="1"/>
+      <w:numFmt w:val="bullet"/>
+      <w:lvlText w:val=""/>
+      <w:lvlJc w:val="left"/>
+      <w:pPr>
+        <w:ind w:left="2880" w:hanging="360"/>
+      </w:pPr>
+      <w:rPr>
+        <w:rFonts w:ascii="Symbol" w:hAnsi="Symbol" w:hint="default"/>
+      </w:rPr>
+    </w:lvl>
+    <w:lvl w:ilvl="4" w:tplc="08090003" w:tentative="1">
+      <w:start w:val="1"/>
+      <w:numFmt w:val="bullet"/>
+      <w:lvlText w:val="o"/>
+      <w:lvlJc w:val="left"/>
+      <w:pPr>
+        <w:ind w:left="3600" w:hanging="360"/>
+      </w:pPr>
+      <w:rPr>
+        <w:rFonts w:ascii="Courier New" w:hAnsi="Courier New" w:cs="Courier New" w:hint="default"/>
+      </w:rPr>
+    </w:lvl>
+    <w:lvl w:ilvl="5" w:tplc="08090005" w:tentative="1">
+      <w:start w:val="1"/>
+      <w:numFmt w:val="bullet"/>
+      <w:lvlText w:val=""/>
+      <w:lvlJc w:val="left"/>
+      <w:pPr>
+        <w:ind w:left="4320" w:hanging="360"/>
+      </w:pPr>
+      <w:rPr>
+        <w:rFonts w:ascii="Wingdings" w:hAnsi="Wingdings" w:hint="default"/>
+      </w:rPr>
+    </w:lvl>
+    <w:lvl w:ilvl="6" w:tplc="08090001" w:tentative="1">
+      <w:start w:val="1"/>
+      <w:numFmt w:val="bullet"/>
+      <w:lvlText w:val=""/>
+      <w:lvlJc w:val="left"/>
+      <w:pPr>
+        <w:ind w:left="5040" w:hanging="360"/>
+      </w:pPr>
+      <w:rPr>
+        <w:rFonts w:ascii="Symbol" w:hAnsi="Symbol" w:hint="default"/>
+      </w:rPr>
+    </w:lvl>
+    <w:lvl w:ilvl="7" w:tplc="08090003" w:tentative="1">
+      <w:start w:val="1"/>
+      <w:numFmt w:val="bullet"/>
+      <w:lvlText w:val="o"/>
+      <w:lvlJc w:val="left"/>
+      <w:pPr>
+        <w:ind w:left="5760" w:hanging="360"/>
+      </w:pPr>
+      <w:rPr>
+        <w:rFonts w:ascii="Courier New" w:hAnsi="Courier New" w:cs="Courier New" w:hint="default"/>
+      </w:rPr>
+    </w:lvl>
+    <w:lvl w:ilvl="8" w:tplc="08090005" w:tentative="1">
+      <w:start w:val="1"/>
+      <w:numFmt w:val="bullet"/>
+      <w:lvlText w:val=""/>
+      <w:lvlJc w:val="left"/>
+      <w:pPr>
+        <w:ind w:left="6480" w:hanging="360"/>
+      </w:pPr>
+      <w:rPr>
+        <w:rFonts w:ascii="Wingdings" w:hAnsi="Wingdings" w:hint="default"/>
+      </w:rPr>
+    </w:lvl>
+  </w:abstractNum>
+  <w:abstractNum w:abstractNumId="2" w15:restartNumberingAfterBreak="0">
     <w:nsid w:val="3FDD48A7"/>
     <w:multiLevelType w:val="hybridMultilevel"/>
     <w:tmpl w:val="2DCC4234"/>
@@ -2766,7 +3751,7 @@
       </w:pPr>
     </w:lvl>
   </w:abstractNum>
-  <w:abstractNum w:abstractNumId="2" w15:restartNumberingAfterBreak="0">
+  <w:abstractNum w:abstractNumId="3" w15:restartNumberingAfterBreak="0">
     <w:nsid w:val="43085F0F"/>
     <w:multiLevelType w:val="hybridMultilevel"/>
     <w:tmpl w:val="EBA6DAB2"/>
@@ -2855,7 +3840,7 @@
       </w:pPr>
     </w:lvl>
   </w:abstractNum>
-  <w:abstractNum w:abstractNumId="3" w15:restartNumberingAfterBreak="0">
+  <w:abstractNum w:abstractNumId="4" w15:restartNumberingAfterBreak="0">
     <w:nsid w:val="490C195F"/>
     <w:multiLevelType w:val="hybridMultilevel"/>
     <w:tmpl w:val="316C7238"/>
@@ -2944,17 +3929,136 @@
       </w:pPr>
     </w:lvl>
   </w:abstractNum>
+  <w:abstractNum w:abstractNumId="5" w15:restartNumberingAfterBreak="0">
+    <w:nsid w:val="58B43312"/>
+    <w:multiLevelType w:val="hybridMultilevel"/>
+    <w:tmpl w:val="CC4AC572"/>
+    <w:lvl w:ilvl="0" w:tplc="08090001">
+      <w:start w:val="1"/>
+      <w:numFmt w:val="bullet"/>
+      <w:lvlText w:val=""/>
+      <w:lvlJc w:val="left"/>
+      <w:pPr>
+        <w:ind w:left="720" w:hanging="360"/>
+      </w:pPr>
+      <w:rPr>
+        <w:rFonts w:ascii="Symbol" w:hAnsi="Symbol" w:hint="default"/>
+      </w:rPr>
+    </w:lvl>
+    <w:lvl w:ilvl="1" w:tplc="08090003">
+      <w:start w:val="1"/>
+      <w:numFmt w:val="bullet"/>
+      <w:lvlText w:val="o"/>
+      <w:lvlJc w:val="left"/>
+      <w:pPr>
+        <w:ind w:left="1440" w:hanging="360"/>
+      </w:pPr>
+      <w:rPr>
+        <w:rFonts w:ascii="Courier New" w:hAnsi="Courier New" w:cs="Courier New" w:hint="default"/>
+      </w:rPr>
+    </w:lvl>
+    <w:lvl w:ilvl="2" w:tplc="08090005" w:tentative="1">
+      <w:start w:val="1"/>
+      <w:numFmt w:val="bullet"/>
+      <w:lvlText w:val=""/>
+      <w:lvlJc w:val="left"/>
+      <w:pPr>
+        <w:ind w:left="2160" w:hanging="360"/>
+      </w:pPr>
+      <w:rPr>
+        <w:rFonts w:ascii="Wingdings" w:hAnsi="Wingdings" w:hint="default"/>
+      </w:rPr>
+    </w:lvl>
+    <w:lvl w:ilvl="3" w:tplc="08090001" w:tentative="1">
+      <w:start w:val="1"/>
+      <w:numFmt w:val="bullet"/>
+      <w:lvlText w:val=""/>
+      <w:lvlJc w:val="left"/>
+      <w:pPr>
+        <w:ind w:left="2880" w:hanging="360"/>
+      </w:pPr>
+      <w:rPr>
+        <w:rFonts w:ascii="Symbol" w:hAnsi="Symbol" w:hint="default"/>
+      </w:rPr>
+    </w:lvl>
+    <w:lvl w:ilvl="4" w:tplc="08090003" w:tentative="1">
+      <w:start w:val="1"/>
+      <w:numFmt w:val="bullet"/>
+      <w:lvlText w:val="o"/>
+      <w:lvlJc w:val="left"/>
+      <w:pPr>
+        <w:ind w:left="3600" w:hanging="360"/>
+      </w:pPr>
+      <w:rPr>
+        <w:rFonts w:ascii="Courier New" w:hAnsi="Courier New" w:cs="Courier New" w:hint="default"/>
+      </w:rPr>
+    </w:lvl>
+    <w:lvl w:ilvl="5" w:tplc="08090005" w:tentative="1">
+      <w:start w:val="1"/>
+      <w:numFmt w:val="bullet"/>
+      <w:lvlText w:val=""/>
+      <w:lvlJc w:val="left"/>
+      <w:pPr>
+        <w:ind w:left="4320" w:hanging="360"/>
+      </w:pPr>
+      <w:rPr>
+        <w:rFonts w:ascii="Wingdings" w:hAnsi="Wingdings" w:hint="default"/>
+      </w:rPr>
+    </w:lvl>
+    <w:lvl w:ilvl="6" w:tplc="08090001" w:tentative="1">
+      <w:start w:val="1"/>
+      <w:numFmt w:val="bullet"/>
+      <w:lvlText w:val=""/>
+      <w:lvlJc w:val="left"/>
+      <w:pPr>
+        <w:ind w:left="5040" w:hanging="360"/>
+      </w:pPr>
+      <w:rPr>
+        <w:rFonts w:ascii="Symbol" w:hAnsi="Symbol" w:hint="default"/>
+      </w:rPr>
+    </w:lvl>
+    <w:lvl w:ilvl="7" w:tplc="08090003" w:tentative="1">
+      <w:start w:val="1"/>
+      <w:numFmt w:val="bullet"/>
+      <w:lvlText w:val="o"/>
+      <w:lvlJc w:val="left"/>
+      <w:pPr>
+        <w:ind w:left="5760" w:hanging="360"/>
+      </w:pPr>
+      <w:rPr>
+        <w:rFonts w:ascii="Courier New" w:hAnsi="Courier New" w:cs="Courier New" w:hint="default"/>
+      </w:rPr>
+    </w:lvl>
+    <w:lvl w:ilvl="8" w:tplc="08090005" w:tentative="1">
+      <w:start w:val="1"/>
+      <w:numFmt w:val="bullet"/>
+      <w:lvlText w:val=""/>
+      <w:lvlJc w:val="left"/>
+      <w:pPr>
+        <w:ind w:left="6480" w:hanging="360"/>
+      </w:pPr>
+      <w:rPr>
+        <w:rFonts w:ascii="Wingdings" w:hAnsi="Wingdings" w:hint="default"/>
+      </w:rPr>
+    </w:lvl>
+  </w:abstractNum>
   <w:num w:numId="1" w16cid:durableId="1893729814">
+    <w:abstractNumId w:val="4"/>
+  </w:num>
+  <w:num w:numId="2" w16cid:durableId="1809784533">
     <w:abstractNumId w:val="3"/>
   </w:num>
-  <w:num w:numId="2" w16cid:durableId="1809784533">
+  <w:num w:numId="3" w16cid:durableId="255021345">
     <w:abstractNumId w:val="2"/>
-  </w:num>
-  <w:num w:numId="3" w16cid:durableId="255021345">
-    <w:abstractNumId w:val="1"/>
   </w:num>
   <w:num w:numId="4" w16cid:durableId="1807505279">
     <w:abstractNumId w:val="0"/>
+  </w:num>
+  <w:num w:numId="5" w16cid:durableId="821654789">
+    <w:abstractNumId w:val="1"/>
+  </w:num>
+  <w:num w:numId="6" w16cid:durableId="1157070408">
+    <w:abstractNumId w:val="5"/>
   </w:num>
 </w:numbering>
 </file>

</xml_diff>